<commit_message>
SEO: Sitemap, robots y 'alt' de productos semánticos
</commit_message>
<xml_diff>
--- a/doc/Informe-Tecnico-SEO.docx
+++ b/doc/Informe-Tecnico-SEO.docx
@@ -66,12 +66,6 @@
         <w:gridCol w:w="6838"/>
       </w:tblGrid>
       <w:tr>
-        <w:tblPrEx>
-          <w:tblCellMar>
-            <w:top w:w="0" w:type="dxa"/>
-            <w:bottom w:w="0" w:type="dxa"/>
-          </w:tblCellMar>
-        </w:tblPrEx>
         <w:tc>
           <w:tcPr>
             <w:tcW w:w="2800" w:type="dxa"/>
@@ -142,12 +136,6 @@
         </w:tc>
       </w:tr>
       <w:tr>
-        <w:tblPrEx>
-          <w:tblCellMar>
-            <w:top w:w="0" w:type="dxa"/>
-            <w:bottom w:w="0" w:type="dxa"/>
-          </w:tblCellMar>
-        </w:tblPrEx>
         <w:tc>
           <w:tcPr>
             <w:tcW w:w="2800" w:type="dxa"/>
@@ -218,12 +206,6 @@
         </w:tc>
       </w:tr>
       <w:tr>
-        <w:tblPrEx>
-          <w:tblCellMar>
-            <w:top w:w="0" w:type="dxa"/>
-            <w:bottom w:w="0" w:type="dxa"/>
-          </w:tblCellMar>
-        </w:tblPrEx>
         <w:tc>
           <w:tcPr>
             <w:tcW w:w="2800" w:type="dxa"/>
@@ -299,7 +281,7 @@
     </w:tbl>
     <w:p>
       <w:pPr>
-        <w:pStyle w:val="Ttulo1"/>
+        <w:pStyle w:val="Heading1"/>
         <w:spacing w:line="276" w:lineRule="auto"/>
         <w:rPr>
           <w:rFonts w:ascii="Calibri" w:hAnsi="Calibri" w:cs="Calibri"/>
@@ -344,7 +326,7 @@
     </w:p>
     <w:p>
       <w:pPr>
-        <w:pStyle w:val="Prrafodelista"/>
+        <w:pStyle w:val="ListParagraph"/>
         <w:numPr>
           <w:ilvl w:val="0"/>
           <w:numId w:val="2"/>
@@ -377,7 +359,7 @@
     </w:p>
     <w:p>
       <w:pPr>
-        <w:pStyle w:val="Prrafodelista"/>
+        <w:pStyle w:val="ListParagraph"/>
         <w:numPr>
           <w:ilvl w:val="0"/>
           <w:numId w:val="2"/>
@@ -410,7 +392,7 @@
     </w:p>
     <w:p>
       <w:pPr>
-        <w:pStyle w:val="Prrafodelista"/>
+        <w:pStyle w:val="ListParagraph"/>
         <w:numPr>
           <w:ilvl w:val="0"/>
           <w:numId w:val="2"/>
@@ -443,7 +425,7 @@
     </w:p>
     <w:p>
       <w:pPr>
-        <w:pStyle w:val="Prrafodelista"/>
+        <w:pStyle w:val="ListParagraph"/>
         <w:numPr>
           <w:ilvl w:val="0"/>
           <w:numId w:val="2"/>
@@ -476,7 +458,7 @@
     </w:p>
     <w:p>
       <w:pPr>
-        <w:pStyle w:val="Ttulo1"/>
+        <w:pStyle w:val="Heading1"/>
         <w:spacing w:line="276" w:lineRule="auto"/>
         <w:rPr>
           <w:rFonts w:ascii="Calibri" w:hAnsi="Calibri" w:cs="Calibri"/>
@@ -521,7 +503,7 @@
     </w:p>
     <w:p>
       <w:pPr>
-        <w:pStyle w:val="Prrafodelista"/>
+        <w:pStyle w:val="ListParagraph"/>
         <w:numPr>
           <w:ilvl w:val="0"/>
           <w:numId w:val="2"/>
@@ -540,7 +522,7 @@
     </w:p>
     <w:p>
       <w:pPr>
-        <w:pStyle w:val="Prrafodelista"/>
+        <w:pStyle w:val="ListParagraph"/>
         <w:numPr>
           <w:ilvl w:val="0"/>
           <w:numId w:val="2"/>
@@ -559,7 +541,7 @@
     </w:p>
     <w:p>
       <w:pPr>
-        <w:pStyle w:val="Prrafodelista"/>
+        <w:pStyle w:val="ListParagraph"/>
         <w:numPr>
           <w:ilvl w:val="0"/>
           <w:numId w:val="2"/>
@@ -592,7 +574,7 @@
     </w:p>
     <w:p>
       <w:pPr>
-        <w:pStyle w:val="Prrafodelista"/>
+        <w:pStyle w:val="ListParagraph"/>
         <w:numPr>
           <w:ilvl w:val="0"/>
           <w:numId w:val="2"/>
@@ -709,7 +691,7 @@
     </w:p>
     <w:p>
       <w:pPr>
-        <w:pStyle w:val="Ttulo1"/>
+        <w:pStyle w:val="Heading1"/>
         <w:spacing w:line="276" w:lineRule="auto"/>
         <w:rPr>
           <w:rFonts w:ascii="Calibri" w:hAnsi="Calibri" w:cs="Calibri"/>
@@ -751,14 +733,14 @@
         <w:rPr>
           <w:rFonts w:ascii="Calibri" w:hAnsi="Calibri" w:cs="Calibri"/>
         </w:rPr>
-        <w:t>Las cuatro páginas usan &lt;</w:t>
-      </w:r>
-      <w:proofErr w:type="spellStart"/>
-      <w:r>
-        <w:rPr>
-          <w:rFonts w:ascii="Calibri" w:hAnsi="Calibri" w:cs="Calibri"/>
-        </w:rPr>
-        <w:t>header</w:t>
+        <w:t>Las cuatro páginas usan &lt;header&gt;, &lt;</w:t>
+      </w:r>
+      <w:proofErr w:type="spellStart"/>
+      <w:r>
+        <w:rPr>
+          <w:rFonts w:ascii="Calibri" w:hAnsi="Calibri" w:cs="Calibri"/>
+        </w:rPr>
+        <w:t>nav</w:t>
       </w:r>
       <w:proofErr w:type="spellEnd"/>
       <w:r>
@@ -772,7 +754,7 @@
         <w:rPr>
           <w:rFonts w:ascii="Calibri" w:hAnsi="Calibri" w:cs="Calibri"/>
         </w:rPr>
-        <w:t>nav</w:t>
+        <w:t>main</w:t>
       </w:r>
       <w:proofErr w:type="spellEnd"/>
       <w:r>
@@ -786,7 +768,7 @@
         <w:rPr>
           <w:rFonts w:ascii="Calibri" w:hAnsi="Calibri" w:cs="Calibri"/>
         </w:rPr>
-        <w:t>main</w:t>
+        <w:t>section</w:t>
       </w:r>
       <w:proofErr w:type="spellEnd"/>
       <w:r>
@@ -800,7 +782,21 @@
         <w:rPr>
           <w:rFonts w:ascii="Calibri" w:hAnsi="Calibri" w:cs="Calibri"/>
         </w:rPr>
-        <w:t>section</w:t>
+        <w:t>article</w:t>
+      </w:r>
+      <w:proofErr w:type="spellEnd"/>
+      <w:r>
+        <w:rPr>
+          <w:rFonts w:ascii="Calibri" w:hAnsi="Calibri" w:cs="Calibri"/>
+        </w:rPr>
+        <w:t>&gt;, &lt;figure&gt;/&lt;</w:t>
+      </w:r>
+      <w:proofErr w:type="spellStart"/>
+      <w:r>
+        <w:rPr>
+          <w:rFonts w:ascii="Calibri" w:hAnsi="Calibri" w:cs="Calibri"/>
+        </w:rPr>
+        <w:t>figcaption</w:t>
       </w:r>
       <w:proofErr w:type="spellEnd"/>
       <w:r>
@@ -814,6 +810,76 @@
         <w:rPr>
           <w:rFonts w:ascii="Calibri" w:hAnsi="Calibri" w:cs="Calibri"/>
         </w:rPr>
+        <w:t>blockquote</w:t>
+      </w:r>
+      <w:proofErr w:type="spellEnd"/>
+      <w:r>
+        <w:rPr>
+          <w:rFonts w:ascii="Calibri" w:hAnsi="Calibri" w:cs="Calibri"/>
+        </w:rPr>
+        <w:t>&gt;, &lt;</w:t>
+      </w:r>
+      <w:proofErr w:type="spellStart"/>
+      <w:r>
+        <w:rPr>
+          <w:rFonts w:ascii="Calibri" w:hAnsi="Calibri" w:cs="Calibri"/>
+        </w:rPr>
+        <w:t>footer</w:t>
+      </w:r>
+      <w:proofErr w:type="spellEnd"/>
+      <w:r>
+        <w:rPr>
+          <w:rFonts w:ascii="Calibri" w:hAnsi="Calibri" w:cs="Calibri"/>
+        </w:rPr>
+        <w:t>&gt; y listas reales (&lt;</w:t>
+      </w:r>
+      <w:proofErr w:type="spellStart"/>
+      <w:r>
+        <w:rPr>
+          <w:rFonts w:ascii="Calibri" w:hAnsi="Calibri" w:cs="Calibri"/>
+        </w:rPr>
+        <w:t>ul</w:t>
+      </w:r>
+      <w:proofErr w:type="spellEnd"/>
+      <w:r>
+        <w:rPr>
+          <w:rFonts w:ascii="Calibri" w:hAnsi="Calibri" w:cs="Calibri"/>
+        </w:rPr>
+        <w:t>&gt;/&lt;</w:t>
+      </w:r>
+      <w:proofErr w:type="spellStart"/>
+      <w:r>
+        <w:rPr>
+          <w:rFonts w:ascii="Calibri" w:hAnsi="Calibri" w:cs="Calibri"/>
+        </w:rPr>
+        <w:t>ol</w:t>
+      </w:r>
+      <w:proofErr w:type="spellEnd"/>
+      <w:r>
+        <w:rPr>
+          <w:rFonts w:ascii="Calibri" w:hAnsi="Calibri" w:cs="Calibri"/>
+        </w:rPr>
+        <w:t>&gt;) en lugar de &lt;</w:t>
+      </w:r>
+      <w:proofErr w:type="spellStart"/>
+      <w:r>
+        <w:rPr>
+          <w:rFonts w:ascii="Calibri" w:hAnsi="Calibri" w:cs="Calibri"/>
+        </w:rPr>
+        <w:t>div</w:t>
+      </w:r>
+      <w:proofErr w:type="spellEnd"/>
+      <w:r>
+        <w:rPr>
+          <w:rFonts w:ascii="Calibri" w:hAnsi="Calibri" w:cs="Calibri"/>
+        </w:rPr>
+        <w:t>&gt; genéricos. Cada tarjeta de producto del Catálogo es un &lt;</w:t>
+      </w:r>
+      <w:proofErr w:type="spellStart"/>
+      <w:r>
+        <w:rPr>
+          <w:rFonts w:ascii="Calibri" w:hAnsi="Calibri" w:cs="Calibri"/>
+        </w:rPr>
         <w:t>article</w:t>
       </w:r>
       <w:proofErr w:type="spellEnd"/>
@@ -821,105 +887,85 @@
         <w:rPr>
           <w:rFonts w:ascii="Calibri" w:hAnsi="Calibri" w:cs="Calibri"/>
         </w:rPr>
-        <w:t>&gt;, &lt;figure&gt;/&lt;</w:t>
-      </w:r>
-      <w:proofErr w:type="spellStart"/>
-      <w:r>
-        <w:rPr>
-          <w:rFonts w:ascii="Calibri" w:hAnsi="Calibri" w:cs="Calibri"/>
-        </w:rPr>
-        <w:t>figcaption</w:t>
-      </w:r>
-      <w:proofErr w:type="spellEnd"/>
-      <w:r>
-        <w:rPr>
-          <w:rFonts w:ascii="Calibri" w:hAnsi="Calibri" w:cs="Calibri"/>
-        </w:rPr>
-        <w:t>&gt;, &lt;</w:t>
-      </w:r>
-      <w:proofErr w:type="spellStart"/>
-      <w:r>
-        <w:rPr>
-          <w:rFonts w:ascii="Calibri" w:hAnsi="Calibri" w:cs="Calibri"/>
-        </w:rPr>
-        <w:t>blockquote</w:t>
-      </w:r>
-      <w:proofErr w:type="spellEnd"/>
-      <w:r>
-        <w:rPr>
-          <w:rFonts w:ascii="Calibri" w:hAnsi="Calibri" w:cs="Calibri"/>
-        </w:rPr>
-        <w:t>&gt;, &lt;</w:t>
-      </w:r>
-      <w:proofErr w:type="spellStart"/>
-      <w:r>
-        <w:rPr>
-          <w:rFonts w:ascii="Calibri" w:hAnsi="Calibri" w:cs="Calibri"/>
-        </w:rPr>
-        <w:t>footer</w:t>
-      </w:r>
-      <w:proofErr w:type="spellEnd"/>
-      <w:r>
-        <w:rPr>
-          <w:rFonts w:ascii="Calibri" w:hAnsi="Calibri" w:cs="Calibri"/>
-        </w:rPr>
-        <w:t>&gt; y listas reales (&lt;</w:t>
-      </w:r>
-      <w:proofErr w:type="spellStart"/>
-      <w:r>
-        <w:rPr>
-          <w:rFonts w:ascii="Calibri" w:hAnsi="Calibri" w:cs="Calibri"/>
-        </w:rPr>
-        <w:t>ul</w:t>
-      </w:r>
-      <w:proofErr w:type="spellEnd"/>
-      <w:r>
-        <w:rPr>
-          <w:rFonts w:ascii="Calibri" w:hAnsi="Calibri" w:cs="Calibri"/>
-        </w:rPr>
-        <w:t>&gt;/&lt;</w:t>
-      </w:r>
-      <w:proofErr w:type="spellStart"/>
-      <w:r>
-        <w:rPr>
-          <w:rFonts w:ascii="Calibri" w:hAnsi="Calibri" w:cs="Calibri"/>
-        </w:rPr>
-        <w:t>ol</w:t>
-      </w:r>
-      <w:proofErr w:type="spellEnd"/>
-      <w:r>
-        <w:rPr>
-          <w:rFonts w:ascii="Calibri" w:hAnsi="Calibri" w:cs="Calibri"/>
-        </w:rPr>
-        <w:t>&gt;) en lugar de &lt;</w:t>
-      </w:r>
-      <w:proofErr w:type="spellStart"/>
-      <w:r>
-        <w:rPr>
-          <w:rFonts w:ascii="Calibri" w:hAnsi="Calibri" w:cs="Calibri"/>
-        </w:rPr>
-        <w:t>div</w:t>
-      </w:r>
-      <w:proofErr w:type="spellEnd"/>
-      <w:r>
-        <w:rPr>
-          <w:rFonts w:ascii="Calibri" w:hAnsi="Calibri" w:cs="Calibri"/>
-        </w:rPr>
-        <w:t>&gt; genéricos. Cada tarjeta de producto del Catálogo es un &lt;</w:t>
-      </w:r>
-      <w:proofErr w:type="spellStart"/>
-      <w:r>
-        <w:rPr>
-          <w:rFonts w:ascii="Calibri" w:hAnsi="Calibri" w:cs="Calibri"/>
-        </w:rPr>
-        <w:t>article</w:t>
-      </w:r>
-      <w:proofErr w:type="spellEnd"/>
-      <w:r>
-        <w:rPr>
-          <w:rFonts w:ascii="Calibri" w:hAnsi="Calibri" w:cs="Calibri"/>
-        </w:rPr>
         <w:t>&gt; con su propio &lt;h2&gt;, ya que cada una es una unidad de contenido independiente y recuperable por sí misma en una búsqueda.</w:t>
+      </w:r>
+      <w:r>
+        <w:rPr>
+          <w:rFonts w:ascii="Calibri" w:hAnsi="Calibri" w:cs="Calibri"/>
+        </w:rPr>
+        <w:t xml:space="preserve"> Se utilizaron</w:t>
+      </w:r>
+      <w:r>
+        <w:rPr>
+          <w:rFonts w:ascii="Calibri" w:hAnsi="Calibri" w:cs="Calibri"/>
+        </w:rPr>
+        <w:t xml:space="preserve"> descripci</w:t>
+      </w:r>
+      <w:r>
+        <w:rPr>
+          <w:rFonts w:ascii="Calibri" w:hAnsi="Calibri" w:cs="Calibri"/>
+        </w:rPr>
+        <w:t>o</w:t>
+      </w:r>
+      <w:r>
+        <w:rPr>
+          <w:rFonts w:ascii="Calibri" w:hAnsi="Calibri" w:cs="Calibri"/>
+        </w:rPr>
+        <w:t>n</w:t>
+      </w:r>
+      <w:r>
+        <w:rPr>
+          <w:rFonts w:ascii="Calibri" w:hAnsi="Calibri" w:cs="Calibri"/>
+        </w:rPr>
+        <w:t xml:space="preserve">es </w:t>
+      </w:r>
+      <w:r>
+        <w:rPr>
+          <w:rFonts w:ascii="Calibri" w:hAnsi="Calibri" w:cs="Calibri"/>
+        </w:rPr>
+        <w:t>semántica</w:t>
+      </w:r>
+      <w:r>
+        <w:rPr>
+          <w:rFonts w:ascii="Calibri" w:hAnsi="Calibri" w:cs="Calibri"/>
+        </w:rPr>
+        <w:t>s en los t</w:t>
+      </w:r>
+      <w:r>
+        <w:rPr>
+          <w:rFonts w:ascii="Calibri" w:hAnsi="Calibri" w:cs="Calibri"/>
+        </w:rPr>
+        <w:t>extos alternativos</w:t>
+      </w:r>
+      <w:r>
+        <w:rPr>
+          <w:rFonts w:ascii="Calibri" w:hAnsi="Calibri" w:cs="Calibri"/>
+        </w:rPr>
+        <w:t xml:space="preserve"> de </w:t>
+      </w:r>
+      <w:r>
+        <w:rPr>
+          <w:rFonts w:ascii="Calibri" w:hAnsi="Calibri" w:cs="Calibri"/>
+        </w:rPr>
+        <w:t>productos</w:t>
+      </w:r>
+      <w:r>
+        <w:rPr>
+          <w:rFonts w:ascii="Calibri" w:hAnsi="Calibri" w:cs="Calibri"/>
+        </w:rPr>
+        <w:t xml:space="preserve"> para </w:t>
+      </w:r>
+      <w:r>
+        <w:rPr>
+          <w:rFonts w:ascii="Calibri" w:hAnsi="Calibri" w:cs="Calibri"/>
+        </w:rPr>
+        <w:t>posicionar en Google Imágenes bajo términos de búsqueda más específicos</w:t>
+      </w:r>
+      <w:r>
+        <w:rPr>
+          <w:rFonts w:ascii="Calibri" w:hAnsi="Calibri" w:cs="Calibri"/>
+        </w:rPr>
+        <w:t>.</w:t>
       </w:r>
     </w:p>
     <w:p>
@@ -949,7 +995,14 @@
         <w:rPr>
           <w:rFonts w:ascii="Calibri" w:hAnsi="Calibri" w:cs="Calibri"/>
         </w:rPr>
-        <w:t xml:space="preserve">Cada página tiene un único &lt;h1&gt;, seguido de &lt;h2&gt; por cada bloque de sección (o por cada producto, en el caso del Catálogo) y &lt;h3&gt; donde corresponde un nivel más, sin saltar niveles. Se corrigieron dos casos reales detectados durante el desarrollo: el rótulo del menú </w:t>
+        <w:t xml:space="preserve">Cada página tiene un único &lt;h1&gt;, seguido de &lt;h2&gt; por cada bloque de sección (o por cada producto, en el caso del Catálogo) y &lt;h3&gt; donde corresponde un nivel más, sin saltar niveles. Se corrigieron dos casos </w:t>
+      </w:r>
+      <w:r>
+        <w:rPr>
+          <w:rFonts w:ascii="Calibri" w:hAnsi="Calibri" w:cs="Calibri"/>
+        </w:rPr>
+        <w:lastRenderedPageBreak/>
+        <w:t xml:space="preserve">reales detectados durante el desarrollo: el rótulo del menú </w:t>
       </w:r>
       <w:proofErr w:type="spellStart"/>
       <w:r>
@@ -963,28 +1016,7 @@
         <w:rPr>
           <w:rFonts w:ascii="Calibri" w:hAnsi="Calibri" w:cs="Calibri"/>
         </w:rPr>
-        <w:t xml:space="preserve"> (“Menú”) estaba marcado como &lt;h2&gt; </w:t>
-      </w:r>
-      <w:r>
-        <w:rPr>
-          <w:rFonts w:ascii="Calibri" w:hAnsi="Calibri" w:cs="Calibri"/>
-        </w:rPr>
-        <w:lastRenderedPageBreak/>
-        <w:t>apareciendo antes del &lt;h1&gt; por estar dentro del &lt;</w:t>
-      </w:r>
-      <w:proofErr w:type="spellStart"/>
-      <w:r>
-        <w:rPr>
-          <w:rFonts w:ascii="Calibri" w:hAnsi="Calibri" w:cs="Calibri"/>
-        </w:rPr>
-        <w:t>header</w:t>
-      </w:r>
-      <w:proofErr w:type="spellEnd"/>
-      <w:r>
-        <w:rPr>
-          <w:rFonts w:ascii="Calibri" w:hAnsi="Calibri" w:cs="Calibri"/>
-        </w:rPr>
-        <w:t xml:space="preserve">&gt;; y en producto.html los encabezados del pie de página (&lt;h3&gt;) quedaban sin un &lt;h2&gt; previo en esa página puntual, generando un salto de nivel. En ambos casos se corrigió la estructura (el rótulo del menú pasó a un elemento sin nivel de </w:t>
+        <w:t xml:space="preserve"> (“Menú”) estaba marcado como &lt;h2&gt; apareciendo antes del &lt;h1&gt; por estar dentro del &lt;header&gt;; y en producto.html los encabezados del pie de página (&lt;h3&gt;) quedaban sin un &lt;h2&gt; previo en esa página puntual, generando un salto de nivel. En ambos casos se corrigió la estructura (el rótulo del menú pasó a un elemento sin nivel de </w:t>
       </w:r>
       <w:proofErr w:type="spellStart"/>
       <w:r>
@@ -1504,201 +1536,27 @@
         <w:spacing w:after="160" w:line="276" w:lineRule="auto"/>
         <w:rPr>
           <w:rFonts w:ascii="Calibri" w:hAnsi="Calibri" w:cs="Calibri"/>
-        </w:rPr>
-      </w:pPr>
-      <w:r>
-        <w:rPr>
-          <w:rFonts w:ascii="Calibri" w:hAnsi="Calibri" w:cs="Calibri"/>
           <w:b/>
           <w:bCs/>
         </w:rPr>
-        <w:t>Datos estructurados (adicional, no exigido por la consigna)</w:t>
-      </w:r>
-    </w:p>
-    <w:p>
-      <w:pPr>
-        <w:spacing w:after="160" w:line="276" w:lineRule="auto"/>
-        <w:rPr>
-          <w:rFonts w:ascii="Calibri" w:hAnsi="Calibri" w:cs="Calibri"/>
-        </w:rPr>
-      </w:pPr>
-      <w:r>
-        <w:rPr>
-          <w:rFonts w:ascii="Calibri" w:hAnsi="Calibri" w:cs="Calibri"/>
-        </w:rPr>
-        <w:t xml:space="preserve">JSON-LD de schema.org en las cuatro páginas: </w:t>
-      </w:r>
-      <w:proofErr w:type="spellStart"/>
-      <w:r>
-        <w:rPr>
-          <w:rFonts w:ascii="Calibri" w:hAnsi="Calibri" w:cs="Calibri"/>
-        </w:rPr>
-        <w:t>ClothingStore</w:t>
-      </w:r>
-      <w:proofErr w:type="spellEnd"/>
-      <w:r>
-        <w:rPr>
-          <w:rFonts w:ascii="Calibri" w:hAnsi="Calibri" w:cs="Calibri"/>
-        </w:rPr>
-        <w:t xml:space="preserve"> (portada), </w:t>
-      </w:r>
-      <w:proofErr w:type="spellStart"/>
-      <w:r>
-        <w:rPr>
-          <w:rFonts w:ascii="Calibri" w:hAnsi="Calibri" w:cs="Calibri"/>
-        </w:rPr>
-        <w:t>CollectionPage</w:t>
-      </w:r>
-      <w:proofErr w:type="spellEnd"/>
-      <w:r>
-        <w:rPr>
-          <w:rFonts w:ascii="Calibri" w:hAnsi="Calibri" w:cs="Calibri"/>
-        </w:rPr>
-        <w:t xml:space="preserve"> (catálogo), </w:t>
-      </w:r>
-      <w:proofErr w:type="spellStart"/>
-      <w:r>
-        <w:rPr>
-          <w:rFonts w:ascii="Calibri" w:hAnsi="Calibri" w:cs="Calibri"/>
-        </w:rPr>
-        <w:t>Product</w:t>
-      </w:r>
-      <w:proofErr w:type="spellEnd"/>
-      <w:r>
-        <w:rPr>
-          <w:rFonts w:ascii="Calibri" w:hAnsi="Calibri" w:cs="Calibri"/>
-        </w:rPr>
-        <w:t xml:space="preserve"> con oferta y precio (producto), y </w:t>
-      </w:r>
-      <w:proofErr w:type="spellStart"/>
-      <w:r>
-        <w:rPr>
-          <w:rFonts w:ascii="Calibri" w:hAnsi="Calibri" w:cs="Calibri"/>
-        </w:rPr>
-        <w:t>ContactPage</w:t>
-      </w:r>
-      <w:proofErr w:type="spellEnd"/>
-      <w:r>
-        <w:rPr>
-          <w:rFonts w:ascii="Calibri" w:hAnsi="Calibri" w:cs="Calibri"/>
-        </w:rPr>
-        <w:t xml:space="preserve"> (contacto).</w:t>
-      </w:r>
-    </w:p>
-    <w:p>
-      <w:pPr>
-        <w:spacing w:after="160" w:line="276" w:lineRule="auto"/>
-        <w:rPr>
-          <w:rFonts w:ascii="Calibri" w:hAnsi="Calibri" w:cs="Calibri"/>
-        </w:rPr>
-      </w:pPr>
+      </w:pPr>
+      <w:proofErr w:type="spellStart"/>
       <w:r>
         <w:rPr>
           <w:rFonts w:ascii="Calibri" w:hAnsi="Calibri" w:cs="Calibri"/>
           <w:b/>
           <w:bCs/>
         </w:rPr>
-        <w:t>Minimización de código redundante</w:t>
-      </w:r>
-    </w:p>
-    <w:p>
-      <w:pPr>
-        <w:spacing w:after="160" w:line="276" w:lineRule="auto"/>
-        <w:rPr>
-          <w:rFonts w:ascii="Calibri" w:hAnsi="Calibri" w:cs="Calibri"/>
-        </w:rPr>
-      </w:pPr>
-      <w:r>
-        <w:rPr>
-          <w:rFonts w:ascii="Calibri" w:hAnsi="Calibri" w:cs="Calibri"/>
-        </w:rPr>
-        <w:t>El CSS de producción se compila en modo comprimido desde Sass (</w:t>
-      </w:r>
-      <w:proofErr w:type="spellStart"/>
-      <w:r>
-        <w:rPr>
-          <w:rFonts w:ascii="Calibri" w:hAnsi="Calibri" w:cs="Calibri"/>
-        </w:rPr>
-        <w:t>css</w:t>
-      </w:r>
-      <w:proofErr w:type="spellEnd"/>
-      <w:r>
-        <w:rPr>
-          <w:rFonts w:ascii="Calibri" w:hAnsi="Calibri" w:cs="Calibri"/>
-        </w:rPr>
-        <w:t xml:space="preserve">/styles.css), y el JavaScript de Bootstrap se usa en su </w:t>
-      </w:r>
-      <w:proofErr w:type="spellStart"/>
-      <w:r>
-        <w:rPr>
-          <w:rFonts w:ascii="Calibri" w:hAnsi="Calibri" w:cs="Calibri"/>
-        </w:rPr>
-        <w:t>build</w:t>
-      </w:r>
-      <w:proofErr w:type="spellEnd"/>
-      <w:r>
-        <w:rPr>
-          <w:rFonts w:ascii="Calibri" w:hAnsi="Calibri" w:cs="Calibri"/>
-        </w:rPr>
-        <w:t xml:space="preserve"> </w:t>
-      </w:r>
-      <w:proofErr w:type="gramStart"/>
-      <w:r>
-        <w:rPr>
-          <w:rFonts w:ascii="Calibri" w:hAnsi="Calibri" w:cs="Calibri"/>
-        </w:rPr>
-        <w:t>oficial .min</w:t>
-      </w:r>
-      <w:proofErr w:type="gramEnd"/>
-      <w:r>
-        <w:rPr>
-          <w:rFonts w:ascii="Calibri" w:hAnsi="Calibri" w:cs="Calibri"/>
-        </w:rPr>
-        <w:t xml:space="preserve">. Las 4 páginas comparten el mismo </w:t>
-      </w:r>
-      <w:proofErr w:type="spellStart"/>
-      <w:r>
-        <w:rPr>
-          <w:rFonts w:ascii="Calibri" w:hAnsi="Calibri" w:cs="Calibri"/>
-        </w:rPr>
-        <w:t>css</w:t>
-      </w:r>
-      <w:proofErr w:type="spellEnd"/>
-      <w:r>
-        <w:rPr>
-          <w:rFonts w:ascii="Calibri" w:hAnsi="Calibri" w:cs="Calibri"/>
-        </w:rPr>
-        <w:t xml:space="preserve">/styles.css y </w:t>
-      </w:r>
-      <w:proofErr w:type="spellStart"/>
-      <w:r>
-        <w:rPr>
-          <w:rFonts w:ascii="Calibri" w:hAnsi="Calibri" w:cs="Calibri"/>
-        </w:rPr>
-        <w:t>js</w:t>
-      </w:r>
-      <w:proofErr w:type="spellEnd"/>
-      <w:r>
-        <w:rPr>
-          <w:rFonts w:ascii="Calibri" w:hAnsi="Calibri" w:cs="Calibri"/>
-        </w:rPr>
-        <w:t>/main.js (sin duplicar código por página).</w:t>
-      </w:r>
-    </w:p>
-    <w:p>
-      <w:pPr>
-        <w:spacing w:after="160" w:line="276" w:lineRule="auto"/>
-        <w:rPr>
-          <w:rFonts w:ascii="Calibri" w:hAnsi="Calibri" w:cs="Calibri"/>
-        </w:rPr>
-      </w:pPr>
+        <w:t>Sitemap</w:t>
+      </w:r>
+      <w:proofErr w:type="spellEnd"/>
       <w:r>
         <w:rPr>
           <w:rFonts w:ascii="Calibri" w:hAnsi="Calibri" w:cs="Calibri"/>
           <w:b/>
           <w:bCs/>
         </w:rPr>
-        <w:t>Tiempo de carga y organización de recursos</w:t>
+        <w:t xml:space="preserve"> y robots</w:t>
       </w:r>
     </w:p>
     <w:p>
@@ -1712,51 +1570,69 @@
         <w:rPr>
           <w:rFonts w:ascii="Calibri" w:hAnsi="Calibri" w:cs="Calibri"/>
         </w:rPr>
-        <w:t xml:space="preserve">Una sola hoja de estilos y un solo </w:t>
-      </w:r>
-      <w:proofErr w:type="spellStart"/>
-      <w:r>
-        <w:rPr>
-          <w:rFonts w:ascii="Calibri" w:hAnsi="Calibri" w:cs="Calibri"/>
-        </w:rPr>
-        <w:t>bundle</w:t>
-      </w:r>
-      <w:proofErr w:type="spellEnd"/>
-      <w:r>
-        <w:rPr>
-          <w:rFonts w:ascii="Calibri" w:hAnsi="Calibri" w:cs="Calibri"/>
-        </w:rPr>
-        <w:t xml:space="preserve"> JS de terceros para todo el sitio. Las imágenes de producto son SVG vectoriales (peso mínimo, nítidas en cualquier densidad de píxeles, y sin las consideraciones de copyright de una fotografía de stock). Las fuentes de Google Fonts se cargan con </w:t>
-      </w:r>
-      <w:proofErr w:type="spellStart"/>
-      <w:r>
-        <w:rPr>
-          <w:rFonts w:ascii="Calibri" w:hAnsi="Calibri" w:cs="Calibri"/>
-        </w:rPr>
-        <w:t>preconnect</w:t>
-      </w:r>
-      <w:proofErr w:type="spellEnd"/>
-      <w:r>
-        <w:rPr>
-          <w:rFonts w:ascii="Calibri" w:hAnsi="Calibri" w:cs="Calibri"/>
-        </w:rPr>
-        <w:t xml:space="preserve"> y </w:t>
-      </w:r>
-      <w:proofErr w:type="spellStart"/>
-      <w:proofErr w:type="gramStart"/>
-      <w:r>
-        <w:rPr>
-          <w:rFonts w:ascii="Calibri" w:hAnsi="Calibri" w:cs="Calibri"/>
-        </w:rPr>
-        <w:t>display:swap</w:t>
-      </w:r>
-      <w:proofErr w:type="spellEnd"/>
-      <w:proofErr w:type="gramEnd"/>
-      <w:r>
-        <w:rPr>
-          <w:rFonts w:ascii="Calibri" w:hAnsi="Calibri" w:cs="Calibri"/>
-        </w:rPr>
-        <w:t>.</w:t>
+        <w:t xml:space="preserve">El proyecto cuenta con un archivo robots.txt en la raíz para dar instrucciones a los </w:t>
+      </w:r>
+      <w:proofErr w:type="spellStart"/>
+      <w:r>
+        <w:rPr>
+          <w:rFonts w:ascii="Calibri" w:hAnsi="Calibri" w:cs="Calibri"/>
+        </w:rPr>
+        <w:t>bots</w:t>
+      </w:r>
+      <w:proofErr w:type="spellEnd"/>
+      <w:r>
+        <w:rPr>
+          <w:rFonts w:ascii="Calibri" w:hAnsi="Calibri" w:cs="Calibri"/>
+        </w:rPr>
+        <w:t xml:space="preserve">, </w:t>
+      </w:r>
+      <w:r>
+        <w:rPr>
+          <w:rFonts w:ascii="Calibri" w:hAnsi="Calibri" w:cs="Calibri"/>
+        </w:rPr>
+        <w:t>el cual p</w:t>
+      </w:r>
+      <w:r>
+        <w:rPr>
+          <w:rFonts w:ascii="Calibri" w:hAnsi="Calibri" w:cs="Calibri"/>
+        </w:rPr>
+        <w:t xml:space="preserve">ermite a los motores de búsqueda rastrear el sitio y apunta al mapa del sitio web </w:t>
+      </w:r>
+      <w:r>
+        <w:rPr>
+          <w:rFonts w:ascii="Calibri" w:hAnsi="Calibri" w:cs="Calibri"/>
+        </w:rPr>
+        <w:t xml:space="preserve">y </w:t>
+      </w:r>
+      <w:r>
+        <w:rPr>
+          <w:rFonts w:ascii="Calibri" w:hAnsi="Calibri" w:cs="Calibri"/>
+        </w:rPr>
+        <w:t>un sitemap.xml para indexar el mapa del sitio</w:t>
+      </w:r>
+      <w:r>
+        <w:rPr>
+          <w:rFonts w:ascii="Calibri" w:hAnsi="Calibri" w:cs="Calibri"/>
+        </w:rPr>
+        <w:t xml:space="preserve"> c</w:t>
+      </w:r>
+      <w:r>
+        <w:rPr>
+          <w:rFonts w:ascii="Calibri" w:hAnsi="Calibri" w:cs="Calibri"/>
+        </w:rPr>
+        <w:t>ont</w:t>
+      </w:r>
+      <w:r>
+        <w:rPr>
+          <w:rFonts w:ascii="Calibri" w:hAnsi="Calibri" w:cs="Calibri"/>
+        </w:rPr>
+        <w:t>eniendo</w:t>
+      </w:r>
+      <w:r>
+        <w:rPr>
+          <w:rFonts w:ascii="Calibri" w:hAnsi="Calibri" w:cs="Calibri"/>
+        </w:rPr>
+        <w:t xml:space="preserve"> las 5 páginas principales con sus frecuencias de cambio y prioridades.</w:t>
       </w:r>
     </w:p>
     <w:p>
@@ -1772,6 +1648,274 @@
           <w:b/>
           <w:bCs/>
         </w:rPr>
+        <w:t>Datos estructurados (adicional, no exigido por la consigna)</w:t>
+      </w:r>
+    </w:p>
+    <w:p>
+      <w:pPr>
+        <w:spacing w:after="160" w:line="276" w:lineRule="auto"/>
+        <w:rPr>
+          <w:rFonts w:ascii="Calibri" w:hAnsi="Calibri" w:cs="Calibri"/>
+        </w:rPr>
+      </w:pPr>
+      <w:r>
+        <w:rPr>
+          <w:rFonts w:ascii="Calibri" w:hAnsi="Calibri" w:cs="Calibri"/>
+        </w:rPr>
+        <w:t xml:space="preserve">JSON-LD de schema.org en las cuatro páginas: </w:t>
+      </w:r>
+      <w:proofErr w:type="spellStart"/>
+      <w:r>
+        <w:rPr>
+          <w:rFonts w:ascii="Calibri" w:hAnsi="Calibri" w:cs="Calibri"/>
+        </w:rPr>
+        <w:t>ClothingStore</w:t>
+      </w:r>
+      <w:proofErr w:type="spellEnd"/>
+      <w:r>
+        <w:rPr>
+          <w:rFonts w:ascii="Calibri" w:hAnsi="Calibri" w:cs="Calibri"/>
+        </w:rPr>
+        <w:t xml:space="preserve"> (portada), </w:t>
+      </w:r>
+      <w:proofErr w:type="spellStart"/>
+      <w:r>
+        <w:rPr>
+          <w:rFonts w:ascii="Calibri" w:hAnsi="Calibri" w:cs="Calibri"/>
+        </w:rPr>
+        <w:t>CollectionPage</w:t>
+      </w:r>
+      <w:proofErr w:type="spellEnd"/>
+      <w:r>
+        <w:rPr>
+          <w:rFonts w:ascii="Calibri" w:hAnsi="Calibri" w:cs="Calibri"/>
+        </w:rPr>
+        <w:t xml:space="preserve"> (catálogo), </w:t>
+      </w:r>
+      <w:proofErr w:type="spellStart"/>
+      <w:r>
+        <w:rPr>
+          <w:rFonts w:ascii="Calibri" w:hAnsi="Calibri" w:cs="Calibri"/>
+        </w:rPr>
+        <w:t>Product</w:t>
+      </w:r>
+      <w:proofErr w:type="spellEnd"/>
+      <w:r>
+        <w:rPr>
+          <w:rFonts w:ascii="Calibri" w:hAnsi="Calibri" w:cs="Calibri"/>
+        </w:rPr>
+        <w:t xml:space="preserve"> con oferta y precio (producto), y </w:t>
+      </w:r>
+      <w:proofErr w:type="spellStart"/>
+      <w:r>
+        <w:rPr>
+          <w:rFonts w:ascii="Calibri" w:hAnsi="Calibri" w:cs="Calibri"/>
+        </w:rPr>
+        <w:t>ContactPage</w:t>
+      </w:r>
+      <w:proofErr w:type="spellEnd"/>
+      <w:r>
+        <w:rPr>
+          <w:rFonts w:ascii="Calibri" w:hAnsi="Calibri" w:cs="Calibri"/>
+        </w:rPr>
+        <w:t xml:space="preserve"> (contacto).</w:t>
+      </w:r>
+    </w:p>
+    <w:p>
+      <w:pPr>
+        <w:spacing w:after="160" w:line="276" w:lineRule="auto"/>
+        <w:rPr>
+          <w:rFonts w:ascii="Calibri" w:hAnsi="Calibri" w:cs="Calibri"/>
+        </w:rPr>
+      </w:pPr>
+      <w:r>
+        <w:rPr>
+          <w:rFonts w:ascii="Calibri" w:hAnsi="Calibri" w:cs="Calibri"/>
+          <w:b/>
+          <w:bCs/>
+        </w:rPr>
+        <w:t>Minimización de código redundante</w:t>
+      </w:r>
+    </w:p>
+    <w:p>
+      <w:pPr>
+        <w:spacing w:after="160" w:line="276" w:lineRule="auto"/>
+        <w:rPr>
+          <w:rFonts w:ascii="Calibri" w:hAnsi="Calibri" w:cs="Calibri"/>
+        </w:rPr>
+      </w:pPr>
+      <w:r>
+        <w:rPr>
+          <w:rFonts w:ascii="Calibri" w:hAnsi="Calibri" w:cs="Calibri"/>
+        </w:rPr>
+        <w:t>El CSS de producción se compila en modo comprimido desde Sass (</w:t>
+      </w:r>
+      <w:proofErr w:type="spellStart"/>
+      <w:r>
+        <w:rPr>
+          <w:rFonts w:ascii="Calibri" w:hAnsi="Calibri" w:cs="Calibri"/>
+        </w:rPr>
+        <w:t>css</w:t>
+      </w:r>
+      <w:proofErr w:type="spellEnd"/>
+      <w:r>
+        <w:rPr>
+          <w:rFonts w:ascii="Calibri" w:hAnsi="Calibri" w:cs="Calibri"/>
+        </w:rPr>
+        <w:t xml:space="preserve">/styles.css), y el JavaScript de Bootstrap se usa en su </w:t>
+      </w:r>
+      <w:proofErr w:type="spellStart"/>
+      <w:r>
+        <w:rPr>
+          <w:rFonts w:ascii="Calibri" w:hAnsi="Calibri" w:cs="Calibri"/>
+        </w:rPr>
+        <w:t>build</w:t>
+      </w:r>
+      <w:proofErr w:type="spellEnd"/>
+      <w:r>
+        <w:rPr>
+          <w:rFonts w:ascii="Calibri" w:hAnsi="Calibri" w:cs="Calibri"/>
+        </w:rPr>
+        <w:t xml:space="preserve"> </w:t>
+      </w:r>
+      <w:proofErr w:type="gramStart"/>
+      <w:r>
+        <w:rPr>
+          <w:rFonts w:ascii="Calibri" w:hAnsi="Calibri" w:cs="Calibri"/>
+        </w:rPr>
+        <w:t>oficial .min</w:t>
+      </w:r>
+      <w:proofErr w:type="gramEnd"/>
+      <w:r>
+        <w:rPr>
+          <w:rFonts w:ascii="Calibri" w:hAnsi="Calibri" w:cs="Calibri"/>
+        </w:rPr>
+        <w:t xml:space="preserve">. Las 4 páginas comparten el mismo </w:t>
+      </w:r>
+      <w:proofErr w:type="spellStart"/>
+      <w:r>
+        <w:rPr>
+          <w:rFonts w:ascii="Calibri" w:hAnsi="Calibri" w:cs="Calibri"/>
+        </w:rPr>
+        <w:t>css</w:t>
+      </w:r>
+      <w:proofErr w:type="spellEnd"/>
+      <w:r>
+        <w:rPr>
+          <w:rFonts w:ascii="Calibri" w:hAnsi="Calibri" w:cs="Calibri"/>
+        </w:rPr>
+        <w:t xml:space="preserve">/styles.css y </w:t>
+      </w:r>
+      <w:proofErr w:type="spellStart"/>
+      <w:r>
+        <w:rPr>
+          <w:rFonts w:ascii="Calibri" w:hAnsi="Calibri" w:cs="Calibri"/>
+        </w:rPr>
+        <w:t>js</w:t>
+      </w:r>
+      <w:proofErr w:type="spellEnd"/>
+      <w:r>
+        <w:rPr>
+          <w:rFonts w:ascii="Calibri" w:hAnsi="Calibri" w:cs="Calibri"/>
+        </w:rPr>
+        <w:t>/main.js (sin duplicar código por página).</w:t>
+      </w:r>
+    </w:p>
+    <w:p>
+      <w:pPr>
+        <w:spacing w:after="160" w:line="276" w:lineRule="auto"/>
+        <w:rPr>
+          <w:rFonts w:ascii="Calibri" w:hAnsi="Calibri" w:cs="Calibri"/>
+        </w:rPr>
+      </w:pPr>
+      <w:r>
+        <w:rPr>
+          <w:rFonts w:ascii="Calibri" w:hAnsi="Calibri" w:cs="Calibri"/>
+          <w:b/>
+          <w:bCs/>
+        </w:rPr>
+        <w:t>Tiempo de carga y organización de recursos</w:t>
+      </w:r>
+    </w:p>
+    <w:p>
+      <w:pPr>
+        <w:spacing w:after="160" w:line="276" w:lineRule="auto"/>
+        <w:rPr>
+          <w:rFonts w:ascii="Calibri" w:hAnsi="Calibri" w:cs="Calibri"/>
+        </w:rPr>
+      </w:pPr>
+      <w:r>
+        <w:rPr>
+          <w:rFonts w:ascii="Calibri" w:hAnsi="Calibri" w:cs="Calibri"/>
+        </w:rPr>
+        <w:t xml:space="preserve">Una sola hoja de estilos y un solo </w:t>
+      </w:r>
+      <w:proofErr w:type="spellStart"/>
+      <w:r>
+        <w:rPr>
+          <w:rFonts w:ascii="Calibri" w:hAnsi="Calibri" w:cs="Calibri"/>
+        </w:rPr>
+        <w:t>bundle</w:t>
+      </w:r>
+      <w:proofErr w:type="spellEnd"/>
+      <w:r>
+        <w:rPr>
+          <w:rFonts w:ascii="Calibri" w:hAnsi="Calibri" w:cs="Calibri"/>
+        </w:rPr>
+        <w:t xml:space="preserve"> JS de terceros para todo el sitio. Las imágenes de producto son SVG vectoriales (peso mínimo, nítidas en cualquier densidad de píxeles, y sin las consideraciones de copyright de una fotografía de stock). Las fuentes de Google Fonts se cargan con </w:t>
+      </w:r>
+      <w:proofErr w:type="spellStart"/>
+      <w:r>
+        <w:rPr>
+          <w:rFonts w:ascii="Calibri" w:hAnsi="Calibri" w:cs="Calibri"/>
+        </w:rPr>
+        <w:t>preconnect</w:t>
+      </w:r>
+      <w:proofErr w:type="spellEnd"/>
+      <w:r>
+        <w:rPr>
+          <w:rFonts w:ascii="Calibri" w:hAnsi="Calibri" w:cs="Calibri"/>
+        </w:rPr>
+        <w:t xml:space="preserve"> y </w:t>
+      </w:r>
+      <w:proofErr w:type="spellStart"/>
+      <w:proofErr w:type="gramStart"/>
+      <w:r>
+        <w:rPr>
+          <w:rFonts w:ascii="Calibri" w:hAnsi="Calibri" w:cs="Calibri"/>
+        </w:rPr>
+        <w:t>display:swap</w:t>
+      </w:r>
+      <w:proofErr w:type="spellEnd"/>
+      <w:proofErr w:type="gramEnd"/>
+      <w:r>
+        <w:rPr>
+          <w:rFonts w:ascii="Calibri" w:hAnsi="Calibri" w:cs="Calibri"/>
+        </w:rPr>
+        <w:t>.</w:t>
+      </w:r>
+    </w:p>
+    <w:p>
+      <w:pPr>
+        <w:spacing w:after="160" w:line="276" w:lineRule="auto"/>
+        <w:rPr>
+          <w:rFonts w:ascii="Calibri" w:hAnsi="Calibri" w:cs="Calibri"/>
+        </w:rPr>
+      </w:pPr>
+    </w:p>
+    <w:p>
+      <w:pPr>
+        <w:spacing w:after="160" w:line="276" w:lineRule="auto"/>
+        <w:rPr>
+          <w:rFonts w:ascii="Calibri" w:hAnsi="Calibri" w:cs="Calibri"/>
+        </w:rPr>
+      </w:pPr>
+      <w:r>
+        <w:rPr>
+          <w:rFonts w:ascii="Calibri" w:hAnsi="Calibri" w:cs="Calibri"/>
+          <w:b/>
+          <w:bCs/>
+        </w:rPr>
         <w:t>Accesibilidad ligada a SEO</w:t>
       </w:r>
     </w:p>
@@ -1861,7 +2005,7 @@
     </w:p>
     <w:p>
       <w:pPr>
-        <w:pStyle w:val="Ttulo1"/>
+        <w:pStyle w:val="Heading1"/>
         <w:spacing w:line="276" w:lineRule="auto"/>
         <w:rPr>
           <w:rFonts w:ascii="Calibri" w:hAnsi="Calibri" w:cs="Calibri"/>
@@ -1887,7 +2031,6 @@
         <w:rPr>
           <w:rFonts w:ascii="Calibri" w:hAnsi="Calibri" w:cs="Calibri"/>
         </w:rPr>
-        <w:lastRenderedPageBreak/>
         <w:t xml:space="preserve">Se calculó manualmente el contraste de cada combinación de color relevante de la paleta, aplicando la fórmula oficial de luminancia relativa del W3C. Las ilustraciones de producto agregadas en esta entrega no introducen combinaciones nuevas de texto sobre fondo (el texto de precios y </w:t>
       </w:r>
       <w:proofErr w:type="spellStart"/>
@@ -1942,12 +2085,6 @@
         <w:gridCol w:w="3438"/>
       </w:tblGrid>
       <w:tr>
-        <w:tblPrEx>
-          <w:tblCellMar>
-            <w:top w:w="0" w:type="dxa"/>
-            <w:bottom w:w="0" w:type="dxa"/>
-          </w:tblCellMar>
-        </w:tblPrEx>
         <w:tc>
           <w:tcPr>
             <w:tcW w:w="4400" w:type="dxa"/>
@@ -2058,12 +2195,6 @@
         </w:tc>
       </w:tr>
       <w:tr>
-        <w:tblPrEx>
-          <w:tblCellMar>
-            <w:top w:w="0" w:type="dxa"/>
-            <w:bottom w:w="0" w:type="dxa"/>
-          </w:tblCellMar>
-        </w:tblPrEx>
         <w:tc>
           <w:tcPr>
             <w:tcW w:w="4400" w:type="dxa"/>
@@ -2201,12 +2332,6 @@
         </w:tc>
       </w:tr>
       <w:tr>
-        <w:tblPrEx>
-          <w:tblCellMar>
-            <w:top w:w="0" w:type="dxa"/>
-            <w:bottom w:w="0" w:type="dxa"/>
-          </w:tblCellMar>
-        </w:tblPrEx>
         <w:tc>
           <w:tcPr>
             <w:tcW w:w="4400" w:type="dxa"/>
@@ -2326,12 +2451,6 @@
         </w:tc>
       </w:tr>
       <w:tr>
-        <w:tblPrEx>
-          <w:tblCellMar>
-            <w:top w:w="0" w:type="dxa"/>
-            <w:bottom w:w="0" w:type="dxa"/>
-          </w:tblCellMar>
-        </w:tblPrEx>
         <w:tc>
           <w:tcPr>
             <w:tcW w:w="4400" w:type="dxa"/>
@@ -2469,12 +2588,6 @@
         </w:tc>
       </w:tr>
       <w:tr>
-        <w:tblPrEx>
-          <w:tblCellMar>
-            <w:top w:w="0" w:type="dxa"/>
-            <w:bottom w:w="0" w:type="dxa"/>
-          </w:tblCellMar>
-        </w:tblPrEx>
         <w:tc>
           <w:tcPr>
             <w:tcW w:w="4400" w:type="dxa"/>
@@ -2594,12 +2707,6 @@
         </w:tc>
       </w:tr>
       <w:tr>
-        <w:tblPrEx>
-          <w:tblCellMar>
-            <w:top w:w="0" w:type="dxa"/>
-            <w:bottom w:w="0" w:type="dxa"/>
-          </w:tblCellMar>
-        </w:tblPrEx>
         <w:tc>
           <w:tcPr>
             <w:tcW w:w="4400" w:type="dxa"/>
@@ -2747,12 +2854,6 @@
         </w:tc>
       </w:tr>
       <w:tr>
-        <w:tblPrEx>
-          <w:tblCellMar>
-            <w:top w:w="0" w:type="dxa"/>
-            <w:bottom w:w="0" w:type="dxa"/>
-          </w:tblCellMar>
-        </w:tblPrEx>
         <w:tc>
           <w:tcPr>
             <w:tcW w:w="4400" w:type="dxa"/>
@@ -2910,7 +3011,7 @@
     </w:tbl>
     <w:p>
       <w:pPr>
-        <w:pStyle w:val="Prrafodelista"/>
+        <w:pStyle w:val="ListParagraph"/>
         <w:spacing w:after="80" w:line="276" w:lineRule="auto"/>
         <w:ind w:left="480"/>
         <w:rPr>
@@ -3627,7 +3728,7 @@
     <w:name w:val="Normal"/>
     <w:qFormat/>
   </w:style>
-  <w:style w:type="paragraph" w:styleId="Ttulo1">
+  <w:style w:type="paragraph" w:styleId="Heading1">
     <w:name w:val="heading 1"/>
     <w:uiPriority w:val="9"/>
     <w:qFormat/>
@@ -3643,7 +3744,7 @@
       <w:szCs w:val="30"/>
     </w:rPr>
   </w:style>
-  <w:style w:type="paragraph" w:styleId="Ttulo2">
+  <w:style w:type="paragraph" w:styleId="Heading2">
     <w:name w:val="heading 2"/>
     <w:uiPriority w:val="9"/>
     <w:semiHidden/>
@@ -3658,7 +3759,7 @@
       <w:szCs w:val="26"/>
     </w:rPr>
   </w:style>
-  <w:style w:type="paragraph" w:styleId="Ttulo3">
+  <w:style w:type="paragraph" w:styleId="Heading3">
     <w:name w:val="heading 3"/>
     <w:uiPriority w:val="9"/>
     <w:semiHidden/>
@@ -3673,7 +3774,7 @@
       <w:szCs w:val="24"/>
     </w:rPr>
   </w:style>
-  <w:style w:type="paragraph" w:styleId="Ttulo4">
+  <w:style w:type="paragraph" w:styleId="Heading4">
     <w:name w:val="heading 4"/>
     <w:uiPriority w:val="9"/>
     <w:semiHidden/>
@@ -3688,7 +3789,7 @@
       <w:color w:val="2E74B5"/>
     </w:rPr>
   </w:style>
-  <w:style w:type="paragraph" w:styleId="Ttulo5">
+  <w:style w:type="paragraph" w:styleId="Heading5">
     <w:name w:val="heading 5"/>
     <w:uiPriority w:val="9"/>
     <w:semiHidden/>
@@ -3701,7 +3802,7 @@
       <w:color w:val="2E74B5"/>
     </w:rPr>
   </w:style>
-  <w:style w:type="paragraph" w:styleId="Ttulo6">
+  <w:style w:type="paragraph" w:styleId="Heading6">
     <w:name w:val="heading 6"/>
     <w:uiPriority w:val="9"/>
     <w:semiHidden/>
@@ -3714,13 +3815,12 @@
       <w:color w:val="1F4D78"/>
     </w:rPr>
   </w:style>
-  <w:style w:type="character" w:default="1" w:styleId="Fuentedeprrafopredeter">
+  <w:style w:type="character" w:default="1" w:styleId="DefaultParagraphFont">
     <w:name w:val="Default Paragraph Font"/>
     <w:uiPriority w:val="1"/>
-    <w:semiHidden/>
     <w:unhideWhenUsed/>
   </w:style>
-  <w:style w:type="table" w:default="1" w:styleId="Tablanormal">
+  <w:style w:type="table" w:default="1" w:styleId="TableNormal">
     <w:name w:val="Normal Table"/>
     <w:uiPriority w:val="99"/>
     <w:semiHidden/>
@@ -3735,13 +3835,13 @@
       </w:tblCellMar>
     </w:tblPr>
   </w:style>
-  <w:style w:type="numbering" w:default="1" w:styleId="Sinlista">
+  <w:style w:type="numbering" w:default="1" w:styleId="NoList">
     <w:name w:val="No List"/>
     <w:uiPriority w:val="99"/>
     <w:semiHidden/>
     <w:unhideWhenUsed/>
   </w:style>
-  <w:style w:type="paragraph" w:styleId="Ttulo">
+  <w:style w:type="paragraph" w:styleId="Title">
     <w:name w:val="Title"/>
     <w:uiPriority w:val="10"/>
     <w:qFormat/>
@@ -3758,11 +3858,11 @@
       <w:bCs/>
     </w:rPr>
   </w:style>
-  <w:style w:type="paragraph" w:styleId="Prrafodelista">
+  <w:style w:type="paragraph" w:styleId="ListParagraph">
     <w:name w:val="List Paragraph"/>
     <w:qFormat/>
   </w:style>
-  <w:style w:type="character" w:styleId="Hipervnculo">
+  <w:style w:type="character" w:styleId="Hyperlink">
     <w:name w:val="Hyperlink"/>
     <w:uiPriority w:val="99"/>
     <w:unhideWhenUsed/>
@@ -3771,7 +3871,7 @@
       <w:u w:val="single"/>
     </w:rPr>
   </w:style>
-  <w:style w:type="character" w:styleId="Refdenotaalpie">
+  <w:style w:type="character" w:styleId="FootnoteReference">
     <w:name w:val="footnote reference"/>
     <w:uiPriority w:val="99"/>
     <w:semiHidden/>
@@ -3780,9 +3880,9 @@
       <w:vertAlign w:val="superscript"/>
     </w:rPr>
   </w:style>
-  <w:style w:type="paragraph" w:styleId="Textonotapie">
+  <w:style w:type="paragraph" w:styleId="FootnoteText">
     <w:name w:val="footnote text"/>
-    <w:link w:val="TextonotapieCar"/>
+    <w:link w:val="FootnoteTextChar"/>
     <w:uiPriority w:val="99"/>
     <w:semiHidden/>
     <w:unhideWhenUsed/>
@@ -3791,9 +3891,9 @@
       <w:szCs w:val="20"/>
     </w:rPr>
   </w:style>
-  <w:style w:type="character" w:customStyle="1" w:styleId="TextonotapieCar">
-    <w:name w:val="Texto nota pie Car"/>
-    <w:link w:val="Textonotapie"/>
+  <w:style w:type="character" w:customStyle="1" w:styleId="FootnoteTextChar">
+    <w:name w:val="Footnote Text Char"/>
+    <w:link w:val="FootnoteText"/>
     <w:uiPriority w:val="99"/>
     <w:semiHidden/>
     <w:unhideWhenUsed/>
@@ -3802,7 +3902,7 @@
       <w:szCs w:val="20"/>
     </w:rPr>
   </w:style>
-  <w:style w:type="character" w:styleId="Refdenotaalfinal">
+  <w:style w:type="character" w:styleId="EndnoteReference">
     <w:name w:val="endnote reference"/>
     <w:uiPriority w:val="99"/>
     <w:semiHidden/>
@@ -3811,9 +3911,9 @@
       <w:vertAlign w:val="superscript"/>
     </w:rPr>
   </w:style>
-  <w:style w:type="paragraph" w:styleId="Textonotaalfinal">
+  <w:style w:type="paragraph" w:styleId="EndnoteText">
     <w:name w:val="endnote text"/>
-    <w:link w:val="TextonotaalfinalCar"/>
+    <w:link w:val="EndnoteTextChar"/>
     <w:uiPriority w:val="99"/>
     <w:semiHidden/>
     <w:unhideWhenUsed/>
@@ -3822,9 +3922,9 @@
       <w:szCs w:val="20"/>
     </w:rPr>
   </w:style>
-  <w:style w:type="character" w:customStyle="1" w:styleId="TextonotaalfinalCar">
-    <w:name w:val="Texto nota al final Car"/>
-    <w:link w:val="Textonotaalfinal"/>
+  <w:style w:type="character" w:customStyle="1" w:styleId="EndnoteTextChar">
+    <w:name w:val="Endnote Text Char"/>
+    <w:link w:val="EndnoteText"/>
     <w:uiPriority w:val="99"/>
     <w:semiHidden/>
     <w:unhideWhenUsed/>
@@ -3833,10 +3933,10 @@
       <w:szCs w:val="20"/>
     </w:rPr>
   </w:style>
-  <w:style w:type="paragraph" w:styleId="Encabezado">
+  <w:style w:type="paragraph" w:styleId="Header">
     <w:name w:val="header"/>
     <w:basedOn w:val="Normal"/>
-    <w:link w:val="EncabezadoCar"/>
+    <w:link w:val="HeaderChar"/>
     <w:uiPriority w:val="99"/>
     <w:unhideWhenUsed/>
     <w:rsid w:val="006121E0"/>
@@ -3847,17 +3947,17 @@
       </w:tabs>
     </w:pPr>
   </w:style>
-  <w:style w:type="character" w:customStyle="1" w:styleId="EncabezadoCar">
-    <w:name w:val="Encabezado Car"/>
-    <w:basedOn w:val="Fuentedeprrafopredeter"/>
-    <w:link w:val="Encabezado"/>
+  <w:style w:type="character" w:customStyle="1" w:styleId="HeaderChar">
+    <w:name w:val="Header Char"/>
+    <w:basedOn w:val="DefaultParagraphFont"/>
+    <w:link w:val="Header"/>
     <w:uiPriority w:val="99"/>
     <w:rsid w:val="006121E0"/>
   </w:style>
-  <w:style w:type="paragraph" w:styleId="Piedepgina">
+  <w:style w:type="paragraph" w:styleId="Footer">
     <w:name w:val="footer"/>
     <w:basedOn w:val="Normal"/>
-    <w:link w:val="PiedepginaCar"/>
+    <w:link w:val="FooterChar"/>
     <w:uiPriority w:val="99"/>
     <w:unhideWhenUsed/>
     <w:rsid w:val="006121E0"/>
@@ -3868,10 +3968,10 @@
       </w:tabs>
     </w:pPr>
   </w:style>
-  <w:style w:type="character" w:customStyle="1" w:styleId="PiedepginaCar">
-    <w:name w:val="Pie de página Car"/>
-    <w:basedOn w:val="Fuentedeprrafopredeter"/>
-    <w:link w:val="Piedepgina"/>
+  <w:style w:type="character" w:customStyle="1" w:styleId="FooterChar">
+    <w:name w:val="Footer Char"/>
+    <w:basedOn w:val="DefaultParagraphFont"/>
+    <w:link w:val="Footer"/>
     <w:uiPriority w:val="99"/>
     <w:rsid w:val="006121E0"/>
   </w:style>

</xml_diff>